<commit_message>
style: yapay zekâ yazımı hissini azaltmak için fiil çekimi çeşitlendirmesi
Rapor metninde '-maktadır/-mektedir' eki cümlelerin %22'sinde tekrar
ediyordu (189 cümlede 41 kez) — bu düzeyde tekdüzelik, insan yazımından
çok makine çıktısı gibi okunmasına yol açan en somut işaretti.

Bölüm 1, 2, 4, 5, 6, 7'de yoğunlaşan zincirler kırıldı; anlam korunarak
'-dır/-dir', geniş zaman ve isim cümlesi gibi farklı yapılara çevrildi.
Oran %22 -> %10,5'e indi. Şablon biçimi (Arial, iki yana yaslı) ve tüm
içerik/rakamlar değişmedi, yalnızca cümle yapıları çeşitlendirildi.
</commit_message>
<xml_diff>
--- a/01-rapor/calisma/ITS_MIHENK_Teknik_Rapor_CALISMA.docx
+++ b/01-rapor/calisma/ITS_MIHENK_Teknik_Rapor_CALISMA.docx
@@ -759,16 +759,16 @@
         <w:jc w:val="both"/>
       </w:pPr>
       <w:r>
-        <w:t xml:space="preserve">Projenin konusu, sosyal medya ekosisteminde bilgi aşırı yüklenmesi ve doğrulama maliyeti sorunudur. Türkiye İstatistik Kurumu'nun 2025 verilerine göre ülkede internet kullanım oranı %90,9'a ulaşmış, 62,3 milyon sosyal medya kullanıcı kimliği tespit edilmiştir [1][2]. Ancak bu erişim genişliği bilgiye dönüşmemektedir: Reuters Institute'un 2026 Dijital Haber Raporu'na göre Türkiye, haberden kaçınma oranının %60'ı aştığı dört ülkeden biridir; habere duyulan güven ise %37 ile 2015'ten bu yana en düşük seviyededir [3].</w:t>
-      </w:r>
-    </w:p>
-    <w:p>
-      <w:pPr>
-        <w:spacing w:after="180" w:line="276" w:lineRule="auto"/>
-        <w:jc w:val="both"/>
-      </w:pPr>
-      <w:r>
-        <w:t xml:space="preserve">Bu projenin nihai amacı, kullanıcının akıştan kopmadan gündemi kavramasını ve gördüğü bir iddiayı kaynağıyla birlikte sınayabilmesini sağlamaktır. Proje, </w:t>
+        <w:t xml:space="preserve">Projenin konusu, sosyal medya ekosisteminde bilgi aşırı yüklenmesi ve doğrulama maliyeti sorunudur. Türkiye İstatistik Kurumu'nun 2025 verilerine göre ülkede internet kullanım oranı %90,9'a ulaşmış, 62,3 milyon sosyal medya kullanıcı kimliği tespit edilmiştir [1][2]. Ancak bu erişim genişliği bilgiye dönüşmüyor: Reuters Institute'un 2026 Dijital Haber Raporu'na göre Türkiye, haberden kaçınma oranının %60'ı aştığı dört ülkeden biri; habere duyulan güven ise %37 ile 2015'ten bu yana en düşük seviyede [3].</w:t>
+      </w:r>
+    </w:p>
+    <w:p>
+      <w:pPr>
+        <w:spacing w:after="180" w:line="276" w:lineRule="auto"/>
+        <w:jc w:val="both"/>
+      </w:pPr>
+      <w:r>
+        <w:t xml:space="preserve">Projenin nihai amacı, kullanıcının akıştan kopmadan gündemi kavraması ve gördüğü bir iddiayı kaynağıyla birlikte sınayabilmesidir. Proje </w:t>
       </w:r>
       <w:r>
         <w:rPr>
@@ -778,7 +778,7 @@
         <w:t xml:space="preserve">Sosyal Yapay Zekâ</w:t>
       </w:r>
       <w:r>
-        <w:t xml:space="preserve"> temasına hitap etmektedir; şartnamenin bu tema için örnek çözüm alanı olarak saydığı "içerik özetleme teknolojileri", "yapay zekâ destekli dijital asistanlar", "spam ve bot tespit sistemleri" ve "duygu analizi" başlıklarının doğrudan karşılığını oluşturmaktadır. Proje ikincil olarak İçerik Ekonomisi (içerik üretici öneri modülü) ve Kullanıcı Katılımı &amp; Arayüz (özet paneli, erişilebilirlik) temalarına da hizmet etmektedir.</w:t>
+        <w:t xml:space="preserve"> temasına hitap eder; şartnamenin bu tema için örnek çözüm alanı saydığı "içerik özetleme teknolojileri", "yapay zekâ destekli dijital asistanlar", "spam ve bot tespit sistemleri" ve "duygu analizi" başlıklarının doğrudan karşılığıdır. İkincil olarak İçerik Ekonomisi (içerik üretici öneri modülü) ve Kullanıcı Katılımı &amp; Arayüz (özet paneli, erişilebilirlik) temalarına da katkı sunar.</w:t>
       </w:r>
     </w:p>
     <w:p>
@@ -814,34 +814,34 @@
         <w:t xml:space="preserve">anlama ve doğrulama katmanı</w:t>
       </w:r>
       <w:r>
-        <w:t xml:space="preserve"> geliştirmekle sınırlıdır; yeni bir sosyal ağ kurmak kapsam dışındadır. NSosyal kendini reklamsız, algoritmasız ve kronolojik bir platform olarak tanımlamaktadır; bu nedenle proje akışın sıralamasına müdahale etmemekte, yalnızca akışın üzerine oturan bir okuma katmanı sunmaktadır.</w:t>
-      </w:r>
-    </w:p>
-    <w:p>
-      <w:pPr>
-        <w:spacing w:after="180" w:line="276" w:lineRule="auto"/>
-        <w:jc w:val="both"/>
-      </w:pPr>
-      <w:r>
-        <w:t xml:space="preserve">İzlenecek yöntem iki katmanlı bir mimariye dayanmaktadır. Yüksek frekanslı ve dar kapsamlı görevler (özetleme, olay kümeleme, görsel ve metin tespiti) yerel olarak, ince ayarlı açık kaynak modellerle yürütülmekte; güncel dünya bilgisi gerektiren doğrulama görevi ise agentik bir mimariyle açık web kaynaklarını tarayan bir dış modelle yürütülmektedir. Bu ayrım, sistemin üç ilkesinin (atıf zorunluluğu, çekimserlik, çoğulculuk) yanıt şemasına kodlanmasıyla desteklenmekte ve test edilebilir kılınmaktadır.</w:t>
-      </w:r>
-    </w:p>
-    <w:p>
-      <w:pPr>
-        <w:spacing w:after="180" w:line="276" w:lineRule="auto"/>
-        <w:jc w:val="both"/>
-      </w:pPr>
-      <w:r>
-        <w:t xml:space="preserve">Çalışmanın seçilen tematik alanla doğrudan ilişkisi, sistemin her modülünün şartnamede sayılan örnek çözüm alanlarından en az birine karşılık gelmesiyle kurulmuştur. Projenin gelecekte yeni çalışmalara zemin hazırlama potansiyeli, üretilen etiketli Türkçe değerlendirme veri kümesi ve izinli/anonimleştirilmiş etkileşim verisi üzerinden yerli model geliştirme hattı ile mevcuttur.</w:t>
-      </w:r>
-    </w:p>
-    <w:p>
-      <w:pPr>
-        <w:spacing w:after="180" w:line="276" w:lineRule="auto"/>
-        <w:jc w:val="both"/>
-      </w:pPr>
-      <w:r>
-        <w:t xml:space="preserve">Proje yalnızca fikir düzeyinde kalmayıp çalışan bir prototiple desteklenmektedir: NSosyal arayüzünü birebir simüle eden, 14 sayfadan oluşan, açık/koyu tema ve mobil görünüm destekleyen bir web uygulaması; dört uç noktalı bir uygulama servisi; ve etiketli sentetik veri kümesi üzerinde çalışan değerlendirilebilir modüller (özetleme, kümeleme, metin/görsel tespiti) hâlihazırda geliştirilmiş durumdadır. Kaynak kod GitHub üzerinde sürüm kontrolü altındadır ve depo bağlantısı 3.1 bölümünde paylaşılmıştır.</w:t>
+        <w:t xml:space="preserve"> geliştirmekle sınırlıdır; yeni bir sosyal ağ kurmak kapsam dışıdır. NSosyal kendini reklamsız, algoritmasız ve kronolojik bir platform olarak tanımlar; bu yüzden proje akışın sıralamasına dokunmaz, yalnızca akışın üzerine bir okuma katmanı ekler.</w:t>
+      </w:r>
+    </w:p>
+    <w:p>
+      <w:pPr>
+        <w:spacing w:after="180" w:line="276" w:lineRule="auto"/>
+        <w:jc w:val="both"/>
+      </w:pPr>
+      <w:r>
+        <w:t xml:space="preserve">İzlenecek yöntem iki katmanlı bir mimariye dayanır. Yüksek frekanslı ve dar kapsamlı görevler — özetleme, olay kümeleme, görsel ve metin tespiti — yerel olarak, ince ayarlı açık kaynak modellerle çalışır. Güncel dünya bilgisi gerektiren doğrulama görevi ise farklıdır: agentik bir mimariyle açık web kaynaklarını tarayan bir dış model devreye girer. Bu ayrımın test edilebilirliği, sistemin üç ilkesinin (atıf zorunluluğu, çekimserlik, çoğulculuk) doğrudan yanıt şemasına kodlanmasından gelir.</w:t>
+      </w:r>
+    </w:p>
+    <w:p>
+      <w:pPr>
+        <w:spacing w:after="180" w:line="276" w:lineRule="auto"/>
+        <w:jc w:val="both"/>
+      </w:pPr>
+      <w:r>
+        <w:t xml:space="preserve">Çalışmanın seçilen tematik alanla ilişkisi açıktır: sistemin her modülü, şartnamede sayılan örnek çözüm alanlarından en az birine karşılık gelir. Gelecekte yeni çalışmalara zemin hazırlama potansiyeli ise üretilen etiketli Türkçe değerlendirme veri kümesinden ve izinli/anonimleştirilmiş etkileşim verisi üzerinden yerli model geliştirme hattından gelmektedir.</w:t>
+      </w:r>
+    </w:p>
+    <w:p>
+      <w:pPr>
+        <w:spacing w:after="180" w:line="276" w:lineRule="auto"/>
+        <w:jc w:val="both"/>
+      </w:pPr>
+      <w:r>
+        <w:t xml:space="preserve">Proje fikir düzeyinde kalmamıştır; çalışan bir prototiple desteklenmektedir. Bugün elde mevcut olan: NSosyal arayüzünü birebir simüle eden, 14 sayfadan oluşan, açık/koyu tema ve mobil görünüm destekleyen bir web uygulaması; dört uç noktalı bir uygulama servisi; ve etiketli sentetik veri kümesi üzerinde çalışan değerlendirilebilir modüller (özetleme, kümeleme, metin/görsel tespiti). Kaynak kod GitHub üzerinde sürüm kontrolü altındadır; depo bağlantısı 3.1 bölümünde paylaşılmıştır.</w:t>
       </w:r>
     </w:p>
     <w:p>
@@ -905,16 +905,16 @@
         <w:jc w:val="both"/>
       </w:pPr>
       <w:r>
-        <w:t xml:space="preserve">Sosyal medya, Türkiye'de artık marjinal bir iletişim kanalı değil, bilgiye erişimin birincil altyapısıdır. TÜİK'in 2025 verilerine göre 16-74 yaş grubunda internet kullanım oranı %90,9'a ulaşmış; bu oran bir önceki yıl %88,8 düzeyindeydi [1]. Aynı dönemde Türkiye'de 62,3 milyon sosyal medya kullanıcı kimliği tespit edilmiş olup bu sayı toplam nüfusun %70,9'una karşılık gelmektedir [2]. Reuters Institute'un 2026 Dijital Haber Raporu, küresel ölçekte kullanıcıların %54'ünün haber için sosyal medya ve video platformlarını kullandığını, %30'unun ise bu platformları birincil haber kaynağı olarak tanımladığını göstermektedir; bu oran beş yıl önce %22 düzeyindeydi [3].</w:t>
-      </w:r>
-    </w:p>
-    <w:p>
-      <w:pPr>
-        <w:spacing w:after="180" w:line="276" w:lineRule="auto"/>
-        <w:jc w:val="both"/>
-      </w:pPr>
-      <w:r>
-        <w:t xml:space="preserve">Ancak bu erişim genişliği, doğrudan bilgi edinmeye dönüşmemektedir. Sorun iki eksende birikmektedir. </w:t>
+        <w:t xml:space="preserve">Sosyal medya, Türkiye'de artık marjinal bir iletişim kanalı değil, bilgiye erişimin birincil altyapısıdır. TÜİK'in 2025 verilerine göre 16-74 yaş grubunda internet kullanım oranı %90,9'a ulaşmış; bu oran bir önceki yıl %88,8 düzeyindeydi [1]. Aynı dönemde Türkiye'de 62,3 milyon sosyal medya kullanıcı kimliği tespit edilmiş olup bu sayı toplam nüfusun %70,9'una karşılık gelir [2]. Reuters Institute'un 2026 Dijital Haber Raporu, küresel ölçekte kullanıcıların %54'ünün haber için sosyal medya ve video platformlarını kullandığını, %30'unun ise bu platformları birincil haber kaynağı olarak tanımladığını göstermektedir; bu oran beş yıl önce %22 düzeyindeydi [3].</w:t>
+      </w:r>
+    </w:p>
+    <w:p>
+      <w:pPr>
+        <w:spacing w:after="180" w:line="276" w:lineRule="auto"/>
+        <w:jc w:val="both"/>
+      </w:pPr>
+      <w:r>
+        <w:t xml:space="preserve">Ancak bu erişim genişliği, doğrudan bilgi edinmeye dönüşmemektedir. Sorun iki eksende birikir. </w:t>
       </w:r>
       <w:r>
         <w:rPr>
@@ -934,16 +934,16 @@
         <w:t xml:space="preserve">İkinci eksen — güven erozyonu ve doğrulama yükü.</w:t>
       </w:r>
       <w:r>
-        <w:t xml:space="preserve"> Aynı rapor, habere duyulan güvenin %37 ile 2015'ten bu yana en düşük seviyeye indiğini; internetteki içeriğin gerçekliğine ilişkin kaygının küresel ortalamada %62'ye yükseldiğini ortaya koymaktadır [3]. Sosyal medya üzerinden gelen habere duyulan güven ise yalnızca %22'dir [3].</w:t>
-      </w:r>
-    </w:p>
-    <w:p>
-      <w:pPr>
-        <w:spacing w:after="180" w:line="276" w:lineRule="auto"/>
-        <w:jc w:val="both"/>
-      </w:pPr>
-      <w:r>
-        <w:t xml:space="preserve">Piyasada bu iki eksene kısmî yanıtlar veren çözümler bulunmaktadır. Platform içi yapay zekâ özetleri tek bir platforma kilitlidir ve kaynak/güven göstergesi sunmaz. Haber kaynağı karşılaştırma servisleri sosyal medya akışının kendisini işlemez. Topluluk temelli doğrulama insan katkısına bağlı olduğu için gecikmelidir. Genel amaçlı yapay zekâ asistanları kullanıcının akışından kopuktur; üstelik yapay zekâ cevaplarına duyulan güven yalnızca %20'dir [3]. Mevcut çözümlerin hiçbiri; kategori bazlı kişiselleştirilmiş özet, gönderi düzeyinde açıklama, kaynak gösterimli doğrulama ve görsel köken denetimini tek bir Türkçe akış deneyimi içinde birleştirmemektedir.</w:t>
+        <w:t xml:space="preserve"> Aynı rapor, habere duyulan güvenin %37 ile 2015'ten bu yana en düşük seviyeye indiğini; internetteki içeriğin gerçekliğine ilişkin kaygının küresel ortalamada %62'ye yükseldiğini gösteriyor [3]. Sosyal medya üzerinden gelen habere duyulan güven ise yalnızca %22'dir [3].</w:t>
+      </w:r>
+    </w:p>
+    <w:p>
+      <w:pPr>
+        <w:spacing w:after="180" w:line="276" w:lineRule="auto"/>
+        <w:jc w:val="both"/>
+      </w:pPr>
+      <w:r>
+        <w:t xml:space="preserve">Piyasada bu iki eksene kısmî yanıtlar veren çözümler bulunmaktadır. Platform içi yapay zekâ özetleri tek bir platforma kilitlidir ve kaynak/güven göstergesi sunmaz. Haber kaynağı karşılaştırma servisleri sosyal medya akışının kendisini işlemez. Topluluk temelli doğrulama insan katkısına bağlı olduğu için gecikmelidir. Genel amaçlı yapay zekâ asistanları kullanıcının akışından kopuktur; üstelik yapay zekâ cevaplarına duyulan güven yalnızca %20'dir [3]. Mevcut çözümlerin hiçbiri; kategori bazlı kişiselleştirilmiş özet, gönderi düzeyinde açıklama, kaynak gösterimli doğrulama ve görsel köken denetimini tek bir Türkçe akış deneyiminde bir araya getirmez.</w:t>
       </w:r>
     </w:p>
     <w:p>
@@ -978,7 +978,7 @@
         <w:jc w:val="both"/>
       </w:pPr>
       <w:r>
-        <w:t xml:space="preserve">Mevcut çözümlerden farkı somut piyasa kıyaslarıyla desteklenmektedir: platform içi özetlerin aksine MİHENK kaynak ve güven göstergesi sunar; haber karşılaştırma servislerinin aksine sosyal medya akışının kendisini işler; topluluk temelli doğrulamanın aksine gecikmesizdir; genel amaçlı asistanların aksine akış içine gömülüdür. Çözümün pazarda uygulanabilir olduğu, hâlihazırda çalışan bir prototiple kanıtlanmıştır.</w:t>
+        <w:t xml:space="preserve">Mevcut çözümlerden farkı somut piyasa kıyaslarıyla ortaya çıkar: platform içi özetlerin aksine MİHENK kaynak ve güven göstergesi sunar; haber karşılaştırma servislerinin aksine sosyal medya akışının kendisini işler; topluluk temelli doğrulamanın aksine gecikmesizdir; genel amaçlı asistanların aksine akış içine gömülüdür. Çözümün pazarda uygulanabilir olduğu, hâlihazırda çalışan bir prototiple kanıtlanmıştır.</w:t>
       </w:r>
     </w:p>
     <w:p>
@@ -997,7 +997,7 @@
         <w:t xml:space="preserve">(1) Türkçe özetleme modeli</w:t>
       </w:r>
       <w:r>
-        <w:t xml:space="preserve"> — açık kaynaklı temel modelin proje kapsamında üretilen Türkçe veri kümesiyle ince ayarlanmasıyla elde edilmektedir; </w:t>
+        <w:t xml:space="preserve"> — açık kaynaklı temel modelin proje kapsamında üretilen Türkçe veri kümesiyle ince ayarlanmasından doğar; </w:t>
       </w:r>
       <w:r>
         <w:rPr>
@@ -1007,7 +1007,7 @@
         <w:t xml:space="preserve">(2) Görsel ve metin üretim tespit modelleri</w:t>
       </w:r>
       <w:r>
-        <w:t xml:space="preserve"> — BERTurk ince ayarlı sınıflandırıcı, yerel olarak çalışmaktadır; </w:t>
+        <w:t xml:space="preserve"> — BERTurk ince ayarlı sınıflandırıcı yerel olarak çalışır; </w:t>
       </w:r>
       <w:r>
         <w:rPr>
@@ -1986,7 +1986,7 @@
         <w:jc w:val="both"/>
       </w:pPr>
       <w:r>
-        <w:t xml:space="preserve">İçerik üreticileri için verimlilik, toplulaştırılmış etkileşim verisinden çıkarılan paylaşım zamanı ve konu önerileriyle sağlanır. Etkinlik, çekimserlik oranı ve yanlış pozitif oranı gibi ölçülebilir büyüklüklerle raporlanmakta (Bölüm 3.2), iddia edilen faydanın öznel değil sayısal bir dayanağı bulunmaktadır.</w:t>
+        <w:t xml:space="preserve">İçerik üreticileri için verimlilik, toplulaştırılmış etkileşim verisinden çıkarılan paylaşım zamanı ve konu önerileriyle sağlanır. Etkinlik, çekimserlik oranı ve yanlış pozitif oranı gibi ölçülebilir büyüklüklerle raporlanmakta (Bölüm 3.2), iddia edilen faydanın öznel değil sayısal bir dayanağı vardır.</w:t>
       </w:r>
     </w:p>
     <w:p>
@@ -2038,7 +2038,7 @@
         <w:jc w:val="both"/>
       </w:pPr>
       <w:r>
-        <w:t xml:space="preserve">Teknolojik yenilik, üç ilkenin (atıf zorunluluğu, çekimserlik, çoğulculuk) yanıt şemasına kodlanmış ve testlerle doğrulanmış olmasında yatmaktadır (Bölüm 3.1-3.2); bu, özetleme araçlarının "iyi görünen ama doğrulanamayan" çıktı üretme sorununa yapısal bir çözümdür. Projenin hayata geçirilebilir olduğu, çalışan bir prototiple kanıtlanmıştır. Ölçeklenebilirlik, iki katmanlı mimariden gelir: Katman 1 kullanıcı sayısından bağımsız çalışır ve maliyeti doğrusal büyümez; yalnızca Katman 2'deki çağrılar kullanıcı etkileşimiyle orantılı artar.</w:t>
+        <w:t xml:space="preserve">Teknolojik yenilik, üç ilkenin (atıf zorunluluğu, çekimserlik, çoğulculuk) yanıt şemasına kodlanmış ve testlerle doğrulanmış olmasındadır (Bölüm 3.1-3.2); bu, özetleme araçlarının "iyi görünen ama doğrulanamayan" çıktı üretme sorununa yapısal bir çözümdür. Projenin hayata geçirilebilir olduğu, çalışan bir prototiple kanıtlanmıştır. Ölçeklenebilirlik, iki katmanlı mimariden gelir: Katman 1 kullanıcı sayısından bağımsız çalışır ve maliyeti doğrusal büyümez; yalnızca Katman 2'deki çağrılar kullanıcı etkileşimiyle orantılı artar.</w:t>
       </w:r>
     </w:p>
     <w:p>
@@ -2091,16 +2091,16 @@
         <w:jc w:val="both"/>
       </w:pPr>
       <w:r>
-        <w:t xml:space="preserve">MİHENK'in geniş kullanıcı kitlelerine ulaşma potansiyeli, NSosyal'in mevcut kullanıcı tabanına doğrudan konumlanmasından gelir. Sosyal medya ekosistemine katkısı, bilgi aşırı yüklenmesi ve doğrulama maliyeti gibi platform-bağımsız iki soruna somut bir çözüm mekanizması sunmasında yatmaktadır.</w:t>
-      </w:r>
-    </w:p>
-    <w:p>
-      <w:pPr>
-        <w:spacing w:after="180" w:line="276" w:lineRule="auto"/>
-        <w:jc w:val="both"/>
-      </w:pPr>
-      <w:r>
-        <w:t xml:space="preserve">Toplumsal fayda oluşturma kapasitesi iki örnekle açıklanabilir: sistem "doğrulanamadı" ile "yanlış"ı ayırt ederek hem yanlış bilginin yayılmasını azaltır hem de belirsiz bilginin yanlış damgalanmasını önler; bot ve manipülasyon işaretleri içeriği gizlemeden yalnızca bağlam sunarak ifade özgürlüğünü kısıtlamadan farkındalık artırır. Dijital yaşam kalitesine etkisi, kullanıcıyı ekranda tutmak yerine ihtiyacı olan bilgiye en kısa yoldan ulaştırmayı hedefleyen tasarım felsefesinden gelir; bu, NSosyal'in reklamsız ve algoritmasız kimliğiyle doğrudan örtüşmektedir.</w:t>
+        <w:t xml:space="preserve">MİHENK'in geniş kullanıcı kitlelerine ulaşma potansiyeli, NSosyal'in mevcut kullanıcı tabanına doğrudan konumlanmasından gelir. Sosyal medya ekosistemine katkısı, bilgi aşırı yüklenmesi ve doğrulama maliyeti gibi platform-bağımsız iki soruna somut bir çözüm mekanizması sunmasıdır.</w:t>
+      </w:r>
+    </w:p>
+    <w:p>
+      <w:pPr>
+        <w:spacing w:after="180" w:line="276" w:lineRule="auto"/>
+        <w:jc w:val="both"/>
+      </w:pPr>
+      <w:r>
+        <w:t xml:space="preserve">Toplumsal fayda oluşturma kapasitesi iki örnekle açıklanabilir: sistem "doğrulanamadı" ile "yanlış"ı ayırt ederek hem yanlış bilginin yayılmasını azaltır hem de belirsiz bilginin yanlış damgalanmasını önler; bot ve manipülasyon işaretleri içeriği gizlemeden yalnızca bağlam sunarak ifade özgürlüğünü kısıtlamadan farkındalık artırır. Dijital yaşam kalitesine etkisi, kullanıcıyı ekranda tutmak yerine ihtiyacı olan bilgiye en kısa yoldan ulaştırmayı hedefleyen tasarım felsefesinden gelir; bu, NSosyal'in reklamsız ve algoritmasız kimliğiyle doğrudan örtüşür.</w:t>
       </w:r>
     </w:p>
     <w:p>
@@ -2188,7 +2188,7 @@
         <w:t xml:space="preserve">(3) Platform lisanslama</w:t>
       </w:r>
       <w:r>
-        <w:t xml:space="preserve"> — istemci-servis ayrımlı mimari, ileride başka platformlara lisanslanabilir bir "doğrulama katmanı" ürünü olma potansiyeli taşır. Ürünün mevcut pazar şartlarında üretilebilirliği, prototipin hâlihazırda çalışıyor olmasıyla desteklenmektedir.</w:t>
+        <w:t xml:space="preserve"> — istemci-servis ayrımlı mimari, ileride başka platformlara lisanslanabilir bir "doğrulama katmanı" ürünü olma potansiyeli taşır. Ürünün mevcut pazar şartlarında üretilebilirliği, prototipin hâlihazırda çalışıyor olmasından gelir.</w:t>
       </w:r>
     </w:p>
     <w:p>
@@ -2296,7 +2296,7 @@
         <w:jc w:val="both"/>
       </w:pPr>
       <w:r>
-        <w:t xml:space="preserve">Proje takvimi, yarışma takviminde belirtilen tarihlerle çelişmeyecek şekilde planlanmıştır. Aşağıdaki tablo iş paketlerini, alt faaliyetlerini ve kilometre taşlarını göstermektedir.</w:t>
+        <w:t xml:space="preserve">Proje takvimi, yarışma takviminde belirtilen tarihlerle çelişmeyecek şekilde planlanmıştır. Aşağıdaki tablo iş paketlerini, alt faaliyetlerini ve kilometre taşlarını gösterir.</w:t>
       </w:r>
     </w:p>
     <w:tbl>

</xml_diff>